<commit_message>
Add PiN parameters step 1 hybrid for South_Sudan___SSD
</commit_message>
<xml_diff>
--- a/platform_PiN_output/South_Sudan___SSD/Param_step1_South_Sudan___SSD_1028_03PM.docx
+++ b/platform_PiN_output/South_Sudan___SSD/Param_step1_South_Sudan___SSD_1028_03PM.docx
@@ -31,7 +31,7 @@
         <w:pStyle w:val="ListBullet"/>
       </w:pPr>
       <w:r>
-        <w:t>Date calculation: 28/10/2025 15:21</w:t>
+        <w:t>Date calculation: 28/10/2025 15:29</w:t>
       </w:r>
     </w:p>
     <w:p>
@@ -79,7 +79,7 @@
         <w:rPr>
           <w:b/>
         </w:rPr>
-        <w:t>no_formal_school</w:t>
+        <w:t>disruption_teacher</w:t>
       </w:r>
       <w:r>
         <w:t>.</w:t>
@@ -122,55 +122,7 @@
         <w:pStyle w:val="ListBullet2"/>
       </w:pPr>
       <w:r>
-        <w:t xml:space="preserve">      2. There is a lack of interest for formal education</w:t>
-      </w:r>
-    </w:p>
-    <w:p>
-      <w:pPr>
-        <w:pStyle w:val="ListBullet2"/>
-      </w:pPr>
-      <w:r>
-        <w:t xml:space="preserve">      4. Lack of appropriate and accessible school</w:t>
-      </w:r>
-    </w:p>
-    <w:p>
-      <w:pPr>
-        <w:pStyle w:val="ListBullet2"/>
-      </w:pPr>
-      <w:r>
-        <w:t xml:space="preserve">      5. The child is too young</w:t>
-      </w:r>
-    </w:p>
-    <w:p>
-      <w:pPr>
-        <w:pStyle w:val="ListBullet2"/>
-      </w:pPr>
-      <w:r>
-        <w:t xml:space="preserve">      6. School does not have enough classrooms that are usable</w:t>
-      </w:r>
-    </w:p>
-    <w:p>
-      <w:pPr>
-        <w:pStyle w:val="ListBullet2"/>
-      </w:pPr>
-      <w:r>
-        <w:t xml:space="preserve">      7. School's WASH facilities are in poor condition or not available</w:t>
-      </w:r>
-    </w:p>
-    <w:p>
-      <w:pPr>
-        <w:pStyle w:val="ListBullet2"/>
-      </w:pPr>
-      <w:r>
-        <w:t xml:space="preserve">      8. School has been closed due to damage, natural disaster, conflict</w:t>
-      </w:r>
-    </w:p>
-    <w:p>
-      <w:pPr>
-        <w:pStyle w:val="ListBullet2"/>
-      </w:pPr>
-      <w:r>
-        <w:t xml:space="preserve">      9. Lack of or poor quality of teachers</w:t>
+        <w:t xml:space="preserve">      16. There is a ban preventing child from attending</w:t>
       </w:r>
     </w:p>
     <w:p>
@@ -215,22 +167,6 @@
     </w:p>
     <w:p>
       <w:pPr>
-        <w:pStyle w:val="ListBullet2"/>
-      </w:pPr>
-      <w:r>
-        <w:t xml:space="preserve">      13. The child's disability or health issues prevents them from accessing school</w:t>
-      </w:r>
-    </w:p>
-    <w:p>
-      <w:pPr>
-        <w:pStyle w:val="ListBullet2"/>
-      </w:pPr>
-      <w:r>
-        <w:t xml:space="preserve">      16. There is a ban preventing child from attending</w:t>
-      </w:r>
-    </w:p>
-    <w:p>
-      <w:pPr>
         <w:pStyle w:val="Heading2"/>
       </w:pPr>
       <w:r>
@@ -250,7 +186,7 @@
         <w:pStyle w:val="ListBullet"/>
       </w:pPr>
       <w:r>
-        <w:t>Mismatch admin: True</w:t>
+        <w:t>Mismatch admin: False</w:t>
       </w:r>
     </w:p>
     <w:p>

</xml_diff>